<commit_message>
feat: Streaming Replication, Switchover , Failover, Rejoin & repmgr implemented
</commit_message>
<xml_diff>
--- a/3_PostgreSQL_Streaming-Replication_RepMgr_Switchover.docx
+++ b/3_PostgreSQL_Streaming-Replication_RepMgr_Switchover.docx
@@ -25,7 +25,49 @@
           <w:color w:val="215E99" w:themeColor="text2" w:themeTint="BF"/>
           <w:sz w:val="40"/>
         </w:rPr>
-        <w:t xml:space="preserve">Replication, Failover, Rejoin &amp; </w:t>
+        <w:t xml:space="preserve">Replication, </w:t>
+      </w:r>
+      <w:proofErr w:type="gramStart"/>
+      <w:r>
+        <w:rPr>
+          <w:b/>
+          <w:color w:val="215E99" w:themeColor="text2" w:themeTint="BF"/>
+          <w:sz w:val="40"/>
+        </w:rPr>
+        <w:t>Switchover</w:t>
+      </w:r>
+      <w:r>
+        <w:rPr>
+          <w:b/>
+          <w:color w:val="215E99" w:themeColor="text2" w:themeTint="BF"/>
+          <w:sz w:val="40"/>
+        </w:rPr>
+        <w:t xml:space="preserve"> </w:t>
+      </w:r>
+      <w:r>
+        <w:rPr>
+          <w:b/>
+          <w:color w:val="215E99" w:themeColor="text2" w:themeTint="BF"/>
+          <w:sz w:val="40"/>
+        </w:rPr>
+        <w:t>,</w:t>
+      </w:r>
+      <w:proofErr w:type="gramEnd"/>
+      <w:r>
+        <w:rPr>
+          <w:b/>
+          <w:color w:val="215E99" w:themeColor="text2" w:themeTint="BF"/>
+          <w:sz w:val="40"/>
+        </w:rPr>
+        <w:t xml:space="preserve"> </w:t>
+      </w:r>
+      <w:r>
+        <w:rPr>
+          <w:b/>
+          <w:color w:val="215E99" w:themeColor="text2" w:themeTint="BF"/>
+          <w:sz w:val="40"/>
+        </w:rPr>
+        <w:t xml:space="preserve">Failover, Rejoin &amp; </w:t>
       </w:r>
       <w:proofErr w:type="spellStart"/>
       <w:r>
@@ -43,7 +85,7 @@
           <w:color w:val="215E99" w:themeColor="text2" w:themeTint="BF"/>
           <w:sz w:val="40"/>
         </w:rPr>
-        <w:t xml:space="preserve"> Switchover</w:t>
+        <w:t xml:space="preserve"> </w:t>
       </w:r>
     </w:p>
     <w:p>
@@ -406,16 +448,7 @@
           <w:color w:val="505050"/>
           <w:sz w:val="18"/>
         </w:rPr>
-        <w:t>Create</w:t>
-      </w:r>
-      <w:r>
-        <w:rPr>
-          <w:rFonts w:ascii="Arial" w:hAnsi="Arial"/>
-          <w:i/>
-          <w:color w:val="505050"/>
-          <w:sz w:val="18"/>
-        </w:rPr>
-        <w:t xml:space="preserve"> a dedicated least-privilege account for replication instead of granting superuser access.</w:t>
+        <w:t>Create a dedicated least-privilege account for replication instead of granting superuser access.</w:t>
       </w:r>
     </w:p>
     <w:p>
@@ -981,13 +1014,7 @@
         <w:rPr>
           <w:color w:val="215E99" w:themeColor="text2" w:themeTint="BF"/>
         </w:rPr>
-        <w:t>Start Streaming Rep</w:t>
-      </w:r>
-      <w:r>
-        <w:rPr>
-          <w:color w:val="215E99" w:themeColor="text2" w:themeTint="BF"/>
-        </w:rPr>
-        <w:t>lication:</w:t>
+        <w:t>Start Streaming Replication:</w:t>
       </w:r>
     </w:p>
     <w:p>
@@ -2690,25 +2717,7 @@
           <w:color w:val="505050"/>
           <w:sz w:val="18"/>
         </w:rPr>
-        <w:t>Promote cs2 to primary and verify</w:t>
-      </w:r>
-      <w:r>
-        <w:rPr>
-          <w:rFonts w:ascii="Arial" w:hAnsi="Arial"/>
-          <w:i/>
-          <w:color w:val="505050"/>
-          <w:sz w:val="18"/>
-        </w:rPr>
-        <w:t xml:space="preserve"> the node's role and confirms </w:t>
-      </w:r>
-      <w:r>
-        <w:rPr>
-          <w:rFonts w:ascii="Arial" w:hAnsi="Arial"/>
-          <w:i/>
-          <w:color w:val="505050"/>
-          <w:sz w:val="18"/>
-        </w:rPr>
-        <w:t>cs2 is now the primary database</w:t>
+        <w:t>Promote cs2 to primary and verify the node's role and confirms cs2 is now the primary database</w:t>
       </w:r>
     </w:p>
     <w:p>
@@ -3056,13 +3065,7 @@
           <w:color w:val="215E99" w:themeColor="text2" w:themeTint="BF"/>
         </w:rPr>
         <w:lastRenderedPageBreak/>
-        <w:t>Rebuild the failed primary (CS1)</w:t>
-      </w:r>
-      <w:r>
-        <w:rPr>
-          <w:color w:val="215E99" w:themeColor="text2" w:themeTint="BF"/>
-        </w:rPr>
-        <w:t>:</w:t>
+        <w:t>Rebuild the failed primary (CS1):</w:t>
       </w:r>
     </w:p>
     <w:p>
@@ -5381,37 +5384,7 @@
         <w:rPr>
           <w:color w:val="215E99" w:themeColor="text2" w:themeTint="BF"/>
         </w:rPr>
-        <w:t>Copy/</w:t>
-      </w:r>
-      <w:r>
-        <w:rPr>
-          <w:color w:val="215E99" w:themeColor="text2" w:themeTint="BF"/>
-        </w:rPr>
-        <w:t>Install cs</w:t>
-      </w:r>
-      <w:r>
-        <w:rPr>
-          <w:color w:val="215E99" w:themeColor="text2" w:themeTint="BF"/>
-        </w:rPr>
-        <w:t>1</w:t>
-      </w:r>
-      <w:r>
-        <w:rPr>
-          <w:color w:val="215E99" w:themeColor="text2" w:themeTint="BF"/>
-        </w:rPr>
-        <w:t>'s public SSH key on cs</w:t>
-      </w:r>
-      <w:r>
-        <w:rPr>
-          <w:color w:val="215E99" w:themeColor="text2" w:themeTint="BF"/>
-        </w:rPr>
-        <w:t>2</w:t>
-      </w:r>
-      <w:r>
-        <w:rPr>
-          <w:color w:val="215E99" w:themeColor="text2" w:themeTint="BF"/>
-        </w:rPr>
-        <w:t xml:space="preserve"> and verify SSH reaches the remote host without a password prompt.</w:t>
+        <w:t>Copy/Install cs1's public SSH key on cs2 and verify SSH reaches the remote host without a password prompt.</w:t>
       </w:r>
     </w:p>
     <w:p>
@@ -5541,13 +5514,7 @@
         <w:rPr>
           <w:color w:val="215E99" w:themeColor="text2" w:themeTint="BF"/>
         </w:rPr>
-        <w:t>Copy/</w:t>
-      </w:r>
-      <w:r>
-        <w:rPr>
-          <w:color w:val="215E99" w:themeColor="text2" w:themeTint="BF"/>
-        </w:rPr>
-        <w:t>Install cs2's public SSH key on cs1 and verify SSH reaches the remote host without a password prompt.</w:t>
+        <w:t>Copy/Install cs2's public SSH key on cs1 and verify SSH reaches the remote host without a password prompt.</w:t>
       </w:r>
     </w:p>
     <w:p>

</xml_diff>